<commit_message>
paper-d: author ORCID (full version only)
Co-Authored-By: Claude Opus 5.5 <noreply@anthropic.com>
</commit_message>
<xml_diff>
--- a/docs/reports/paper_d/submission/paper_d_full.docx
+++ b/docs/reports/paper_d/submission/paper_d_full.docx
@@ -90,10 +90,21 @@
         <w:pStyle w:val="BodyText"/>
       </w:pPr>
       <w:r>
-        <w:t xml:space="preserve">jonnabio@gmail.com ORCID: [AUTHOR: ORCID]</w:t>
-      </w:r>
+        <w:t xml:space="preserve">jonnabio@gmail.com ORCID:</w:t>
+      </w:r>
+      <w:r>
+        <w:t xml:space="preserve"> </w:t>
+      </w:r>
+      <w:hyperlink r:id="rId9">
+        <w:r>
+          <w:rPr>
+            <w:rStyle w:val="Hyperlink"/>
+          </w:rPr>
+          <w:t xml:space="preserve">https://orcid.org/0000-0002-7149-6635</w:t>
+        </w:r>
+      </w:hyperlink>
     </w:p>
-    <w:bookmarkStart w:id="9" w:name="abstract"/>
+    <w:bookmarkStart w:id="10" w:name="abstract"/>
     <w:p>
       <w:pPr>
         <w:pStyle w:val="Heading1"/>
@@ -300,8 +311,8 @@
         <w:t xml:space="preserve">misclassification; explanation reliability; SHAP; LIME.</w:t>
       </w:r>
     </w:p>
-    <w:bookmarkEnd w:id="9"/>
-    <w:bookmarkStart w:id="10" w:name="resumen"/>
+    <w:bookmarkEnd w:id="10"/>
+    <w:bookmarkStart w:id="11" w:name="resumen"/>
     <w:p>
       <w:pPr>
         <w:pStyle w:val="Heading1"/>
@@ -508,8 +519,8 @@
         <w:t xml:space="preserve">hoc; errores de clasificación; fiabilidad de las explicaciones; SHAP; LIME.</w:t>
       </w:r>
     </w:p>
-    <w:bookmarkEnd w:id="10"/>
-    <w:bookmarkStart w:id="11" w:name="introduction"/>
+    <w:bookmarkEnd w:id="11"/>
+    <w:bookmarkStart w:id="12" w:name="introduction"/>
     <w:p>
       <w:pPr>
         <w:pStyle w:val="Heading1"/>
@@ -832,8 +843,8 @@
         <w:t xml:space="preserve">(RQ4)?</w:t>
       </w:r>
     </w:p>
-    <w:bookmarkEnd w:id="11"/>
-    <w:bookmarkStart w:id="15" w:name="materials-and-methods"/>
+    <w:bookmarkEnd w:id="12"/>
+    <w:bookmarkStart w:id="16" w:name="materials-and-methods"/>
     <w:p>
       <w:pPr>
         <w:pStyle w:val="Heading1"/>
@@ -842,7 +853,7 @@
         <w:t xml:space="preserve">Materials and methods</w:t>
       </w:r>
     </w:p>
-    <w:bookmarkStart w:id="12" w:name="datasets-and-experimental-runs"/>
+    <w:bookmarkStart w:id="13" w:name="datasets-and-experimental-runs"/>
     <w:p>
       <w:pPr>
         <w:pStyle w:val="Heading2"/>
@@ -1079,8 +1090,8 @@
         <w:t xml:space="preserve">per quadrant.</w:t>
       </w:r>
     </w:p>
-    <w:bookmarkEnd w:id="12"/>
-    <w:bookmarkStart w:id="13" w:name="quality-metrics"/>
+    <w:bookmarkEnd w:id="13"/>
+    <w:bookmarkStart w:id="14" w:name="quality-metrics"/>
     <w:p>
       <w:pPr>
         <w:pStyle w:val="Heading2"/>
@@ -1922,8 +1933,8 @@
         <w:t xml:space="preserve">described.</w:t>
       </w:r>
     </w:p>
-    <w:bookmarkEnd w:id="13"/>
-    <w:bookmarkStart w:id="14" w:name="statistical-analysis"/>
+    <w:bookmarkEnd w:id="14"/>
+    <w:bookmarkStart w:id="15" w:name="statistical-analysis"/>
     <w:p>
       <w:pPr>
         <w:pStyle w:val="Heading2"/>
@@ -2738,9 +2749,9 @@
         <w:t xml:space="preserve">instances, and RQ1 on seed 42 alone; (4) a check of the mechanism proposed for RQ3.</w:t>
       </w:r>
     </w:p>
-    <w:bookmarkEnd w:id="14"/>
     <w:bookmarkEnd w:id="15"/>
-    <w:bookmarkStart w:id="35" w:name="results"/>
+    <w:bookmarkEnd w:id="16"/>
+    <w:bookmarkStart w:id="36" w:name="results"/>
     <w:p>
       <w:pPr>
         <w:pStyle w:val="Heading1"/>
@@ -2749,7 +2760,7 @@
         <w:t xml:space="preserve">Results</w:t>
       </w:r>
     </w:p>
-    <w:bookmarkStart w:id="21" w:name="X113a1311184c30a7f1c357e0d675c998f9d33b0"/>
+    <w:bookmarkStart w:id="22" w:name="X113a1311184c30a7f1c357e0d675c998f9d33b0"/>
     <w:p>
       <w:pPr>
         <w:pStyle w:val="Heading2"/>
@@ -2866,7 +2877,7 @@
         <w:t xml:space="preserve">0.005 of zero; only Anchors was slower on errors.</w:t>
       </w:r>
     </w:p>
-    <w:bookmarkStart w:id="16" w:name="tab:rq1"/>
+    <w:bookmarkStart w:id="17" w:name="tab:rq1"/>
     <w:p>
       <w:pPr>
         <w:pStyle w:val="TableCaption"/>
@@ -4560,8 +4571,8 @@
         </w:tc>
       </w:tr>
     </w:tbl>
-    <w:bookmarkEnd w:id="16"/>
-    <w:bookmarkStart w:id="20" w:name="fig:rq1"/>
+    <w:bookmarkEnd w:id="17"/>
+    <w:bookmarkStart w:id="21" w:name="fig:rq1"/>
     <w:p>
       <w:pPr>
         <w:pStyle w:val="CaptionedFigure"/>
@@ -4571,18 +4582,18 @@
           <wp:inline>
             <wp:extent cx="4800600" cy="1590214"/>
             <wp:effectExtent b="0" l="0" r="0" t="0"/>
-            <wp:docPr descr="" title="" id="18" name="Picture"/>
+            <wp:docPr descr="" title="" id="19" name="Picture"/>
             <a:graphic>
               <a:graphicData uri="http://schemas.openxmlformats.org/drawingml/2006/picture">
                 <pic:pic>
                   <pic:nvPicPr>
-                    <pic:cNvPr descr="figures/fig1.png" id="19" name="Picture"/>
+                    <pic:cNvPr descr="figures/fig1.png" id="20" name="Picture"/>
                     <pic:cNvPicPr>
                       <a:picLocks noChangeArrowheads="1" noChangeAspect="1"/>
                     </pic:cNvPicPr>
                   </pic:nvPicPr>
                   <pic:blipFill>
-                    <a:blip r:embed="rId17"/>
+                    <a:blip r:embed="rId18"/>
                     <a:stretch>
                       <a:fillRect/>
                     </a:stretch>
@@ -4635,9 +4646,9 @@
         <w:t xml:space="preserve">near zero while the mean is not). Negative values mean lower quality on errors.</w:t>
       </w:r>
     </w:p>
-    <w:bookmarkEnd w:id="20"/>
     <w:bookmarkEnd w:id="21"/>
-    <w:bookmarkStart w:id="27" w:name="model-families-and-error-types-rq2-rq3"/>
+    <w:bookmarkEnd w:id="22"/>
+    <w:bookmarkStart w:id="28" w:name="model-families-and-error-types-rq2-rq3"/>
     <w:p>
       <w:pPr>
         <w:pStyle w:val="Heading2"/>
@@ -4695,7 +4706,7 @@
         <w:t xml:space="preserve">the DiCE deficit appeared in every family.</w:t>
       </w:r>
     </w:p>
-    <w:bookmarkStart w:id="25" w:name="fig:rq2"/>
+    <w:bookmarkStart w:id="26" w:name="fig:rq2"/>
     <w:p>
       <w:pPr>
         <w:pStyle w:val="CaptionedFigure"/>
@@ -4705,18 +4716,18 @@
           <wp:inline>
             <wp:extent cx="4800600" cy="1665106"/>
             <wp:effectExtent b="0" l="0" r="0" t="0"/>
-            <wp:docPr descr="" title="" id="23" name="Picture"/>
+            <wp:docPr descr="" title="" id="24" name="Picture"/>
             <a:graphic>
               <a:graphicData uri="http://schemas.openxmlformats.org/drawingml/2006/picture">
                 <pic:pic>
                   <pic:nvPicPr>
-                    <pic:cNvPr descr="figures/fig2.png" id="24" name="Picture"/>
+                    <pic:cNvPr descr="figures/fig2.png" id="25" name="Picture"/>
                     <pic:cNvPicPr>
                       <a:picLocks noChangeArrowheads="1" noChangeAspect="1"/>
                     </pic:cNvPicPr>
                   </pic:nvPicPr>
                   <pic:blipFill>
-                    <a:blip r:embed="rId22"/>
+                    <a:blip r:embed="rId23"/>
                     <a:stretch>
                       <a:fillRect/>
                     </a:stretch>
@@ -4769,7 +4780,7 @@
         <w:t xml:space="preserve">and Anchors stability differences are small on this scale.</w:t>
       </w:r>
     </w:p>
-    <w:bookmarkEnd w:id="25"/>
+    <w:bookmarkEnd w:id="26"/>
     <w:p>
       <w:pPr>
         <w:pStyle w:val="BodyText"/>
@@ -4831,7 +4842,7 @@
         <w:t xml:space="preserve">is not comparable across predicted classes.</w:t>
       </w:r>
     </w:p>
-    <w:bookmarkStart w:id="26" w:name="tab:rq3"/>
+    <w:bookmarkStart w:id="27" w:name="tab:rq3"/>
     <w:p>
       <w:pPr>
         <w:pStyle w:val="TableCaption"/>
@@ -5262,9 +5273,9 @@
         </w:tc>
       </w:tr>
     </w:tbl>
-    <w:bookmarkEnd w:id="26"/>
     <w:bookmarkEnd w:id="27"/>
-    <w:bookmarkStart w:id="33" w:name="the-role-of-the-decision-boundary-rq4"/>
+    <w:bookmarkEnd w:id="28"/>
+    <w:bookmarkStart w:id="34" w:name="the-role-of-the-decision-boundary-rq4"/>
     <w:p>
       <w:pPr>
         <w:pStyle w:val="Heading2"/>
@@ -5374,7 +5385,7 @@
         <w:t xml:space="preserve">+0.014; DiCE’s deficit reversed).</w:t>
       </w:r>
     </w:p>
-    <w:bookmarkStart w:id="28" w:name="tab:rq4"/>
+    <w:bookmarkStart w:id="29" w:name="tab:rq4"/>
     <w:p>
       <w:pPr>
         <w:pStyle w:val="TableCaption"/>
@@ -6182,8 +6193,8 @@
         </w:tc>
       </w:tr>
     </w:tbl>
-    <w:bookmarkEnd w:id="28"/>
-    <w:bookmarkStart w:id="32" w:name="fig:rq4"/>
+    <w:bookmarkEnd w:id="29"/>
+    <w:bookmarkStart w:id="33" w:name="fig:rq4"/>
     <w:p>
       <w:pPr>
         <w:pStyle w:val="CaptionedFigure"/>
@@ -6193,18 +6204,18 @@
           <wp:inline>
             <wp:extent cx="4800600" cy="1590955"/>
             <wp:effectExtent b="0" l="0" r="0" t="0"/>
-            <wp:docPr descr="" title="" id="30" name="Picture"/>
+            <wp:docPr descr="" title="" id="31" name="Picture"/>
             <a:graphic>
               <a:graphicData uri="http://schemas.openxmlformats.org/drawingml/2006/picture">
                 <pic:pic>
                   <pic:nvPicPr>
-                    <pic:cNvPr descr="figures/fig3.png" id="31" name="Picture"/>
+                    <pic:cNvPr descr="figures/fig3.png" id="32" name="Picture"/>
                     <pic:cNvPicPr>
                       <a:picLocks noChangeArrowheads="1" noChangeAspect="1"/>
                     </pic:cNvPicPr>
                   </pic:nvPicPr>
                   <pic:blipFill>
-                    <a:blip r:embed="rId29"/>
+                    <a:blip r:embed="rId30"/>
                     <a:stretch>
                       <a:fillRect/>
                     </a:stretch>
@@ -6287,9 +6298,9 @@
         <w:t xml:space="preserve">misclassified instances (UCI Adult; bins of width 0.05 with at least 30 instances).</w:t>
       </w:r>
     </w:p>
-    <w:bookmarkEnd w:id="32"/>
     <w:bookmarkEnd w:id="33"/>
-    <w:bookmarkStart w:id="34" w:name="sec:sens"/>
+    <w:bookmarkEnd w:id="34"/>
+    <w:bookmarkStart w:id="35" w:name="sec:sens"/>
     <w:p>
       <w:pPr>
         <w:pStyle w:val="Heading2"/>
@@ -6403,9 +6414,9 @@
         <w:t xml:space="preserve">so we know of no reason for the reversal.</w:t>
       </w:r>
     </w:p>
-    <w:bookmarkEnd w:id="34"/>
     <w:bookmarkEnd w:id="35"/>
-    <w:bookmarkStart w:id="36" w:name="discussion"/>
+    <w:bookmarkEnd w:id="36"/>
+    <w:bookmarkStart w:id="37" w:name="discussion"/>
     <w:p>
       <w:pPr>
         <w:pStyle w:val="Heading1"/>
@@ -6561,8 +6572,8 @@
         <w:t xml:space="preserve">so whether users are misled needs a user study.</w:t>
       </w:r>
     </w:p>
-    <w:bookmarkEnd w:id="36"/>
-    <w:bookmarkStart w:id="37" w:name="conclusions"/>
+    <w:bookmarkEnd w:id="37"/>
+    <w:bookmarkStart w:id="38" w:name="conclusions"/>
     <w:p>
       <w:pPr>
         <w:pStyle w:val="Heading1"/>
@@ -6615,8 +6626,8 @@
         <w:t xml:space="preserve">describes the explanations that are needed least.</w:t>
       </w:r>
     </w:p>
-    <w:bookmarkEnd w:id="37"/>
-    <w:bookmarkStart w:id="39" w:name="data-availability"/>
+    <w:bookmarkEnd w:id="38"/>
+    <w:bookmarkStart w:id="40" w:name="data-availability"/>
     <w:p>
       <w:pPr>
         <w:pStyle w:val="Heading1"/>
@@ -6650,7 +6661,7 @@
       <w:r>
         <w:t xml:space="preserve"> </w:t>
       </w:r>
-      <w:hyperlink r:id="rId38">
+      <w:hyperlink r:id="rId39">
         <w:r>
           <w:rPr>
             <w:rStyle w:val="Hyperlink"/>
@@ -6668,8 +6679,8 @@
         <w:t xml:space="preserve">will be cited.</w:t>
       </w:r>
     </w:p>
-    <w:bookmarkEnd w:id="39"/>
-    <w:bookmarkStart w:id="77" w:name="acknowledgments"/>
+    <w:bookmarkEnd w:id="40"/>
+    <w:bookmarkStart w:id="78" w:name="acknowledgments"/>
     <w:p>
       <w:pPr>
         <w:pStyle w:val="Heading1"/>
@@ -6704,8 +6715,8 @@
         <w:t xml:space="preserve">statement and is responsible for the content.</w:t>
       </w:r>
     </w:p>
-    <w:bookmarkStart w:id="76" w:name="refs"/>
-    <w:bookmarkStart w:id="40" w:name="ref-lundberg2017unified"/>
+    <w:bookmarkStart w:id="77" w:name="refs"/>
+    <w:bookmarkStart w:id="41" w:name="ref-lundberg2017unified"/>
     <w:p>
       <w:pPr>
         <w:pStyle w:val="Bibliography"/>
@@ -6748,8 +6759,8 @@
         <w:t xml:space="preserve">, 2017, pp. 4765–4774.</w:t>
       </w:r>
     </w:p>
-    <w:bookmarkEnd w:id="40"/>
-    <w:bookmarkStart w:id="42" w:name="ref-ribeiro2016why"/>
+    <w:bookmarkEnd w:id="41"/>
+    <w:bookmarkStart w:id="43" w:name="ref-ribeiro2016why"/>
     <w:p>
       <w:pPr>
         <w:pStyle w:val="Bibliography"/>
@@ -6815,7 +6826,7 @@
       <w:r>
         <w:t xml:space="preserve"> </w:t>
       </w:r>
-      <w:hyperlink r:id="rId41">
+      <w:hyperlink r:id="rId42">
         <w:r>
           <w:rPr>
             <w:rStyle w:val="Hyperlink"/>
@@ -6827,8 +6838,8 @@
         <w:t xml:space="preserve">.</w:t>
       </w:r>
     </w:p>
-    <w:bookmarkEnd w:id="42"/>
-    <w:bookmarkStart w:id="44" w:name="ref-ribeiro2018anchors"/>
+    <w:bookmarkEnd w:id="43"/>
+    <w:bookmarkStart w:id="45" w:name="ref-ribeiro2018anchors"/>
     <w:p>
       <w:pPr>
         <w:pStyle w:val="Bibliography"/>
@@ -6873,7 +6884,7 @@
       <w:r>
         <w:t xml:space="preserve"> </w:t>
       </w:r>
-      <w:hyperlink r:id="rId43">
+      <w:hyperlink r:id="rId44">
         <w:r>
           <w:rPr>
             <w:rStyle w:val="Hyperlink"/>
@@ -6885,8 +6896,8 @@
         <w:t xml:space="preserve">.</w:t>
       </w:r>
     </w:p>
-    <w:bookmarkEnd w:id="44"/>
-    <w:bookmarkStart w:id="46" w:name="ref-mothilal2020dice"/>
+    <w:bookmarkEnd w:id="45"/>
+    <w:bookmarkStart w:id="47" w:name="ref-mothilal2020dice"/>
     <w:p>
       <w:pPr>
         <w:pStyle w:val="Bibliography"/>
@@ -6931,7 +6942,7 @@
       <w:r>
         <w:t xml:space="preserve"> </w:t>
       </w:r>
-      <w:hyperlink r:id="rId45">
+      <w:hyperlink r:id="rId46">
         <w:r>
           <w:rPr>
             <w:rStyle w:val="Hyperlink"/>
@@ -6943,8 +6954,8 @@
         <w:t xml:space="preserve">.</w:t>
       </w:r>
     </w:p>
-    <w:bookmarkEnd w:id="46"/>
-    <w:bookmarkStart w:id="47" w:name="ref-bhatt2020evaluating"/>
+    <w:bookmarkEnd w:id="47"/>
+    <w:bookmarkStart w:id="48" w:name="ref-bhatt2020evaluating"/>
     <w:p>
       <w:pPr>
         <w:pStyle w:val="Bibliography"/>
@@ -6987,8 +6998,8 @@
         <w:t xml:space="preserve">, 2020, pp. 3016–3022.</w:t>
       </w:r>
     </w:p>
-    <w:bookmarkEnd w:id="47"/>
-    <w:bookmarkStart w:id="48" w:name="ref-samek2017evaluating"/>
+    <w:bookmarkEnd w:id="48"/>
+    <w:bookmarkStart w:id="49" w:name="ref-samek2017evaluating"/>
     <w:p>
       <w:pPr>
         <w:pStyle w:val="Bibliography"/>
@@ -7025,8 +7036,8 @@
         <w:t xml:space="preserve">, vol. 28, no. 11, pp. 2660–2673, 2017.</w:t>
       </w:r>
     </w:p>
-    <w:bookmarkEnd w:id="48"/>
-    <w:bookmarkStart w:id="49" w:name="ref-hooker2019benchmark"/>
+    <w:bookmarkEnd w:id="49"/>
+    <w:bookmarkStart w:id="50" w:name="ref-hooker2019benchmark"/>
     <w:p>
       <w:pPr>
         <w:pStyle w:val="Bibliography"/>
@@ -7069,8 +7080,8 @@
         <w:t xml:space="preserve">, 2019, pp. 9737–9748.</w:t>
       </w:r>
     </w:p>
-    <w:bookmarkEnd w:id="49"/>
-    <w:bookmarkStart w:id="51" w:name="ref-alvarezmelis2018robustness"/>
+    <w:bookmarkEnd w:id="50"/>
+    <w:bookmarkStart w:id="52" w:name="ref-alvarezmelis2018robustness"/>
     <w:p>
       <w:pPr>
         <w:pStyle w:val="Bibliography"/>
@@ -7115,7 +7126,7 @@
       <w:r>
         <w:t xml:space="preserve"> </w:t>
       </w:r>
-      <w:hyperlink r:id="rId50">
+      <w:hyperlink r:id="rId51">
         <w:r>
           <w:rPr>
             <w:rStyle w:val="Hyperlink"/>
@@ -7124,8 +7135,8 @@
         </w:r>
       </w:hyperlink>
     </w:p>
-    <w:bookmarkEnd w:id="51"/>
-    <w:bookmarkStart w:id="52" w:name="ref-herrera2026framework"/>
+    <w:bookmarkEnd w:id="52"/>
+    <w:bookmarkStart w:id="53" w:name="ref-herrera2026framework"/>
     <w:p>
       <w:pPr>
         <w:pStyle w:val="Bibliography"/>
@@ -7176,8 +7187,8 @@
         <w:t xml:space="preserve">, no. 3, 2026.</w:t>
       </w:r>
     </w:p>
-    <w:bookmarkEnd w:id="52"/>
-    <w:bookmarkStart w:id="53" w:name="ref-bansal2021whole"/>
+    <w:bookmarkEnd w:id="53"/>
+    <w:bookmarkStart w:id="54" w:name="ref-bansal2021whole"/>
     <w:p>
       <w:pPr>
         <w:pStyle w:val="Bibliography"/>
@@ -7257,8 +7268,8 @@
         <w:t xml:space="preserve">, 2021, pp. 1–16.</w:t>
       </w:r>
     </w:p>
-    <w:bookmarkEnd w:id="53"/>
-    <w:bookmarkStart w:id="54" w:name="ref-adebayo2018sanity"/>
+    <w:bookmarkEnd w:id="54"/>
+    <w:bookmarkStart w:id="55" w:name="ref-adebayo2018sanity"/>
     <w:p>
       <w:pPr>
         <w:pStyle w:val="Bibliography"/>
@@ -7301,8 +7312,8 @@
         <w:t xml:space="preserve">, 2018, pp. 9505–9515.</w:t>
       </w:r>
     </w:p>
-    <w:bookmarkEnd w:id="54"/>
-    <w:bookmarkStart w:id="55" w:name="ref-slack2020fooling"/>
+    <w:bookmarkEnd w:id="55"/>
+    <w:bookmarkStart w:id="56" w:name="ref-slack2020fooling"/>
     <w:p>
       <w:pPr>
         <w:pStyle w:val="Bibliography"/>
@@ -7366,8 +7377,8 @@
         <w:t xml:space="preserve">, 2020, pp. 180–186.</w:t>
       </w:r>
     </w:p>
-    <w:bookmarkEnd w:id="55"/>
-    <w:bookmarkStart w:id="56" w:name="ref-rudin2019stop"/>
+    <w:bookmarkEnd w:id="56"/>
+    <w:bookmarkStart w:id="57" w:name="ref-rudin2019stop"/>
     <w:p>
       <w:pPr>
         <w:pStyle w:val="Bibliography"/>
@@ -7404,8 +7415,8 @@
         <w:t xml:space="preserve">, vol. 1, no. 5, pp. 206–215, 2019.</w:t>
       </w:r>
     </w:p>
-    <w:bookmarkEnd w:id="56"/>
-    <w:bookmarkStart w:id="57" w:name="ref-lofstrom2026concerning"/>
+    <w:bookmarkEnd w:id="57"/>
+    <w:bookmarkStart w:id="58" w:name="ref-lofstrom2026concerning"/>
     <w:p>
       <w:pPr>
         <w:pStyle w:val="Bibliography"/>
@@ -7451,8 +7462,8 @@
         <w:t xml:space="preserve">, vol. 384, no. 2327, p. 20250079, 2026.</w:t>
       </w:r>
     </w:p>
-    <w:bookmarkEnd w:id="57"/>
-    <w:bookmarkStart w:id="59" w:name="ref-chiaburu2026uncertainty"/>
+    <w:bookmarkEnd w:id="58"/>
+    <w:bookmarkStart w:id="60" w:name="ref-chiaburu2026uncertainty"/>
     <w:p>
       <w:pPr>
         <w:pStyle w:val="Bibliography"/>
@@ -7515,7 +7526,7 @@
       <w:r>
         <w:t xml:space="preserve"> </w:t>
       </w:r>
-      <w:hyperlink r:id="rId58">
+      <w:hyperlink r:id="rId59">
         <w:r>
           <w:rPr>
             <w:rStyle w:val="Hyperlink"/>
@@ -7527,8 +7538,8 @@
         <w:t xml:space="preserve">.</w:t>
       </w:r>
     </w:p>
-    <w:bookmarkEnd w:id="59"/>
-    <w:bookmarkStart w:id="61" w:name="ref-christodoulou2026impact"/>
+    <w:bookmarkEnd w:id="60"/>
+    <w:bookmarkStart w:id="62" w:name="ref-christodoulou2026impact"/>
     <w:p>
       <w:pPr>
         <w:pStyle w:val="Bibliography"/>
@@ -7567,7 +7578,7 @@
       <w:r>
         <w:t xml:space="preserve"> </w:t>
       </w:r>
-      <w:hyperlink r:id="rId60">
+      <w:hyperlink r:id="rId61">
         <w:r>
           <w:rPr>
             <w:rStyle w:val="Hyperlink"/>
@@ -7579,8 +7590,8 @@
         <w:t xml:space="preserve">.</w:t>
       </w:r>
     </w:p>
-    <w:bookmarkEnd w:id="61"/>
-    <w:bookmarkStart w:id="63" w:name="ref-cheng2026uncertainty"/>
+    <w:bookmarkEnd w:id="62"/>
+    <w:bookmarkStart w:id="64" w:name="ref-cheng2026uncertainty"/>
     <w:p>
       <w:pPr>
         <w:pStyle w:val="Bibliography"/>
@@ -7628,7 +7639,7 @@
       <w:r>
         <w:t xml:space="preserve"> </w:t>
       </w:r>
-      <w:hyperlink r:id="rId62">
+      <w:hyperlink r:id="rId63">
         <w:r>
           <w:rPr>
             <w:rStyle w:val="Hyperlink"/>
@@ -7640,8 +7651,8 @@
         <w:t xml:space="preserve">.</w:t>
       </w:r>
     </w:p>
-    <w:bookmarkEnd w:id="63"/>
-    <w:bookmarkStart w:id="64" w:name="ref-becker1996adult"/>
+    <w:bookmarkEnd w:id="64"/>
+    <w:bookmarkStart w:id="65" w:name="ref-becker1996adult"/>
     <w:p>
       <w:pPr>
         <w:pStyle w:val="Bibliography"/>
@@ -7669,50 +7680,50 @@
       </w:r>
       <w:r>
         <w:t xml:space="preserve">UCI Machine Learning Repository, 1996.</w:t>
-      </w:r>
-    </w:p>
-    <w:bookmarkEnd w:id="64"/>
-    <w:bookmarkStart w:id="65" w:name="ref-hofmann1994statlog"/>
-    <w:p>
-      <w:pPr>
-        <w:pStyle w:val="Bibliography"/>
-      </w:pPr>
-      <w:r>
-        <w:t xml:space="preserve">[19]</w:t>
-      </w:r>
-      <w:r>
-        <w:t xml:space="preserve"> </w:t>
-      </w:r>
-      <w:r>
-        <w:t xml:space="preserve">	</w:t>
-      </w:r>
-      <w:r>
-        <w:t xml:space="preserve">H. Hofmann,</w:t>
-      </w:r>
-      <w:r>
-        <w:t xml:space="preserve"> </w:t>
-      </w:r>
-      <w:r>
-        <w:t xml:space="preserve">“Statlog (</w:t>
-      </w:r>
-      <w:r>
-        <w:t xml:space="preserve">German</w:t>
-      </w:r>
-      <w:r>
-        <w:t xml:space="preserve"> </w:t>
-      </w:r>
-      <w:r>
-        <w:t xml:space="preserve">credit data) [dataset].”</w:t>
-      </w:r>
-      <w:r>
-        <w:t xml:space="preserve"> </w:t>
-      </w:r>
-      <w:r>
-        <w:t xml:space="preserve">UCI Machine Learning Repository, 1994.</w:t>
       </w:r>
     </w:p>
     <w:bookmarkEnd w:id="65"/>
-    <w:bookmarkStart w:id="66" w:name="ref-breiman2001random"/>
+    <w:bookmarkStart w:id="66" w:name="ref-hofmann1994statlog"/>
+    <w:p>
+      <w:pPr>
+        <w:pStyle w:val="Bibliography"/>
+      </w:pPr>
+      <w:r>
+        <w:t xml:space="preserve">[19]</w:t>
+      </w:r>
+      <w:r>
+        <w:t xml:space="preserve"> </w:t>
+      </w:r>
+      <w:r>
+        <w:t xml:space="preserve">	</w:t>
+      </w:r>
+      <w:r>
+        <w:t xml:space="preserve">H. Hofmann,</w:t>
+      </w:r>
+      <w:r>
+        <w:t xml:space="preserve"> </w:t>
+      </w:r>
+      <w:r>
+        <w:t xml:space="preserve">“Statlog (</w:t>
+      </w:r>
+      <w:r>
+        <w:t xml:space="preserve">German</w:t>
+      </w:r>
+      <w:r>
+        <w:t xml:space="preserve"> </w:t>
+      </w:r>
+      <w:r>
+        <w:t xml:space="preserve">credit data) [dataset].”</w:t>
+      </w:r>
+      <w:r>
+        <w:t xml:space="preserve"> </w:t>
+      </w:r>
+      <w:r>
+        <w:t xml:space="preserve">UCI Machine Learning Repository, 1994.</w:t>
+      </w:r>
+    </w:p>
+    <w:bookmarkEnd w:id="66"/>
+    <w:bookmarkStart w:id="67" w:name="ref-breiman2001random"/>
     <w:p>
       <w:pPr>
         <w:pStyle w:val="Bibliography"/>
@@ -7749,8 +7760,8 @@
         <w:t xml:space="preserve">, vol. 45, no. 1, pp. 5–32, 2001.</w:t>
       </w:r>
     </w:p>
-    <w:bookmarkEnd w:id="66"/>
-    <w:bookmarkStart w:id="67" w:name="ref-chen2016xgboost"/>
+    <w:bookmarkEnd w:id="67"/>
+    <w:bookmarkStart w:id="68" w:name="ref-chen2016xgboost"/>
     <w:p>
       <w:pPr>
         <w:pStyle w:val="Bibliography"/>
@@ -7799,8 +7810,8 @@
         <w:t xml:space="preserve">, 2016, pp. 785–794.</w:t>
       </w:r>
     </w:p>
-    <w:bookmarkEnd w:id="67"/>
-    <w:bookmarkStart w:id="68" w:name="ref-wilcoxon1945individual"/>
+    <w:bookmarkEnd w:id="68"/>
+    <w:bookmarkStart w:id="69" w:name="ref-wilcoxon1945individual"/>
     <w:p>
       <w:pPr>
         <w:pStyle w:val="Bibliography"/>
@@ -7837,8 +7848,8 @@
         <w:t xml:space="preserve">, vol. 1, no. 6, pp. 80–83, 1945.</w:t>
       </w:r>
     </w:p>
-    <w:bookmarkEnd w:id="68"/>
-    <w:bookmarkStart w:id="69" w:name="ref-holm1979simple"/>
+    <w:bookmarkEnd w:id="69"/>
+    <w:bookmarkStart w:id="70" w:name="ref-holm1979simple"/>
     <w:p>
       <w:pPr>
         <w:pStyle w:val="Bibliography"/>
@@ -7875,8 +7886,8 @@
         <w:t xml:space="preserve">, vol. 6, no. 2, pp. 65–70, 1979.</w:t>
       </w:r>
     </w:p>
-    <w:bookmarkEnd w:id="69"/>
-    <w:bookmarkStart w:id="70" w:name="ref-lakens2013calculating"/>
+    <w:bookmarkEnd w:id="70"/>
+    <w:bookmarkStart w:id="71" w:name="ref-lakens2013calculating"/>
     <w:p>
       <w:pPr>
         <w:pStyle w:val="Bibliography"/>
@@ -7922,8 +7933,8 @@
         <w:t xml:space="preserve">, vol. 4, p. 863, 2013.</w:t>
       </w:r>
     </w:p>
-    <w:bookmarkEnd w:id="70"/>
-    <w:bookmarkStart w:id="72" w:name="ref-kruskal1952use"/>
+    <w:bookmarkEnd w:id="71"/>
+    <w:bookmarkStart w:id="73" w:name="ref-kruskal1952use"/>
     <w:p>
       <w:pPr>
         <w:pStyle w:val="Bibliography"/>
@@ -7962,7 +7973,7 @@
       <w:r>
         <w:t xml:space="preserve"> </w:t>
       </w:r>
-      <w:hyperlink r:id="rId71">
+      <w:hyperlink r:id="rId72">
         <w:r>
           <w:rPr>
             <w:rStyle w:val="Hyperlink"/>
@@ -7974,8 +7985,8 @@
         <w:t xml:space="preserve">.</w:t>
       </w:r>
     </w:p>
-    <w:bookmarkEnd w:id="72"/>
-    <w:bookmarkStart w:id="74" w:name="ref-cameron2015practitioner"/>
+    <w:bookmarkEnd w:id="73"/>
+    <w:bookmarkStart w:id="75" w:name="ref-cameron2015practitioner"/>
     <w:p>
       <w:pPr>
         <w:pStyle w:val="Bibliography"/>
@@ -8014,7 +8025,7 @@
       <w:r>
         <w:t xml:space="preserve"> </w:t>
       </w:r>
-      <w:hyperlink r:id="rId73">
+      <w:hyperlink r:id="rId74">
         <w:r>
           <w:rPr>
             <w:rStyle w:val="Hyperlink"/>
@@ -8026,8 +8037,8 @@
         <w:t xml:space="preserve">.</w:t>
       </w:r>
     </w:p>
-    <w:bookmarkEnd w:id="74"/>
-    <w:bookmarkStart w:id="75" w:name="ref-platt1999probabilistic"/>
+    <w:bookmarkEnd w:id="75"/>
+    <w:bookmarkStart w:id="76" w:name="ref-platt1999probabilistic"/>
     <w:p>
       <w:pPr>
         <w:pStyle w:val="Bibliography"/>
@@ -8070,9 +8081,9 @@
         <w:t xml:space="preserve">, A. J. Smola, P. Bartlett, B. Schölkopf, and D. Schuurmans, Eds., MIT Press, 1999, pp. 61–74.</w:t>
       </w:r>
     </w:p>
-    <w:bookmarkEnd w:id="75"/>
     <w:bookmarkEnd w:id="76"/>
     <w:bookmarkEnd w:id="77"/>
+    <w:bookmarkEnd w:id="78"/>
     <w:sectPr>
       <w:pgSz w:w="12240" w:h="15840"/>
       <w:pgMar w:top="1418" w:right="1418" w:bottom="1418" w:left="1418" w:header="720" w:footer="720" w:gutter="0"/>

</xml_diff>

<commit_message>
docs(paper-d): cite the archived release (Zenodo 10.5281/zenodo.23130014)
Release paper-d-submission-2026-10-03, version 0.5.0. The blind statement
now also names the public datasets and the regeneration instructions.

Co-Authored-By: Claude Opus 5.5 <noreply@anthropic.com>
</commit_message>
<xml_diff>
--- a/docs/reports/paper_d/submission/paper_d_full.docx
+++ b/docs/reports/paper_d/submission/paper_d_full.docx
@@ -6597,7 +6597,7 @@
       </w:r>
     </w:p>
     <w:bookmarkEnd w:id="38"/>
-    <w:bookmarkStart w:id="40" w:name="data-availability"/>
+    <w:bookmarkStart w:id="41" w:name="data-availability"/>
     <w:p>
       <w:pPr>
         <w:pStyle w:val="Heading1"/>
@@ -6620,13 +6620,13 @@
         <w:t xml:space="preserve">[18], [19]</w:t>
       </w:r>
       <w:r>
-        <w:t xml:space="preserve">. The code, the trained</w:t>
-      </w:r>
-      <w:r>
-        <w:t xml:space="preserve"> </w:t>
-      </w:r>
-      <w:r>
-        <w:t xml:space="preserve">models, the per-instance run outputs and the analysis results are available at</w:t>
+        <w:t xml:space="preserve">. The code, trained</w:t>
+      </w:r>
+      <w:r>
+        <w:t xml:space="preserve"> </w:t>
+      </w:r>
+      <w:r>
+        <w:t xml:space="preserve">models, per-instance run outputs and analysis results are available at</w:t>
       </w:r>
       <w:r>
         <w:t xml:space="preserve"> </w:t>
@@ -6661,7 +6661,21 @@
         <w:t xml:space="preserve"> </w:t>
       </w:r>
       <w:r>
-        <w:t xml:space="preserve">archived at [ZENODO VERSION DOI PENDING]. Every reported value can be regenerated from the stored runs</w:t>
+        <w:t xml:space="preserve">archived at</w:t>
+      </w:r>
+      <w:r>
+        <w:t xml:space="preserve"> </w:t>
+      </w:r>
+      <w:hyperlink r:id="rId40">
+        <w:r>
+          <w:rPr>
+            <w:rStyle w:val="Hyperlink"/>
+          </w:rPr>
+          <w:t xml:space="preserve">https://doi.org/10.5281/zenodo.23130014</w:t>
+        </w:r>
+      </w:hyperlink>
+      <w:r>
+        <w:t xml:space="preserve">. Every reported value can be regenerated from the stored runs</w:t>
       </w:r>
       <w:r>
         <w:t xml:space="preserve"> </w:t>
@@ -6679,29 +6693,11 @@
         <w:t xml:space="preserve">docs/reports/paper_d/README.md</w:t>
       </w:r>
       <w:r>
-        <w:t xml:space="preserve">, with the package versions fixed in</w:t>
-      </w:r>
-      <w:r>
-        <w:t xml:space="preserve"> </w:t>
-      </w:r>
-      <w:r>
-        <w:rPr>
-          <w:rStyle w:val="VerbatimChar"/>
-        </w:rPr>
-        <w:t xml:space="preserve">docs/reports/paper_d/requirements.txt</w:t>
-      </w:r>
-      <w:r>
-        <w:t xml:space="preserve">; the explanation runs themselves were not</w:t>
-      </w:r>
-      <w:r>
-        <w:t xml:space="preserve"> </w:t>
-      </w:r>
-      <w:r>
-        <w:t xml:space="preserve">repeated.</w:t>
+        <w:t xml:space="preserve">.</w:t>
       </w:r>
     </w:p>
-    <w:bookmarkEnd w:id="40"/>
-    <w:bookmarkStart w:id="41" w:name="Xe536ab5833287908b18f3f9d173acc61830ffab"/>
+    <w:bookmarkEnd w:id="41"/>
+    <w:bookmarkStart w:id="42" w:name="Xe536ab5833287908b18f3f9d173acc61830ffab"/>
     <w:p>
       <w:pPr>
         <w:pStyle w:val="Heading1"/>
@@ -6710,8 +6706,8 @@
         <w:t xml:space="preserve">References</w:t>
       </w:r>
     </w:p>
-    <w:bookmarkStart w:id="78" w:name="refs"/>
-    <w:bookmarkStart w:id="42" w:name="ref-lundberg2017unified"/>
+    <w:bookmarkStart w:id="79" w:name="refs"/>
+    <w:bookmarkStart w:id="43" w:name="ref-lundberg2017unified"/>
     <w:p>
       <w:pPr>
         <w:pStyle w:val="Bibliography"/>
@@ -6754,8 +6750,8 @@
         <w:t xml:space="preserve">, 2017, pp. 4765–4774.</w:t>
       </w:r>
     </w:p>
-    <w:bookmarkEnd w:id="42"/>
-    <w:bookmarkStart w:id="44" w:name="ref-ribeiro2016why"/>
+    <w:bookmarkEnd w:id="43"/>
+    <w:bookmarkStart w:id="45" w:name="ref-ribeiro2016why"/>
     <w:p>
       <w:pPr>
         <w:pStyle w:val="Bibliography"/>
@@ -6821,7 +6817,7 @@
       <w:r>
         <w:t xml:space="preserve"> </w:t>
       </w:r>
-      <w:hyperlink r:id="rId43">
+      <w:hyperlink r:id="rId44">
         <w:r>
           <w:rPr>
             <w:rStyle w:val="Hyperlink"/>
@@ -6833,8 +6829,8 @@
         <w:t xml:space="preserve">.</w:t>
       </w:r>
     </w:p>
-    <w:bookmarkEnd w:id="44"/>
-    <w:bookmarkStart w:id="46" w:name="ref-ribeiro2018anchors"/>
+    <w:bookmarkEnd w:id="45"/>
+    <w:bookmarkStart w:id="47" w:name="ref-ribeiro2018anchors"/>
     <w:p>
       <w:pPr>
         <w:pStyle w:val="Bibliography"/>
@@ -6879,7 +6875,7 @@
       <w:r>
         <w:t xml:space="preserve"> </w:t>
       </w:r>
-      <w:hyperlink r:id="rId45">
+      <w:hyperlink r:id="rId46">
         <w:r>
           <w:rPr>
             <w:rStyle w:val="Hyperlink"/>
@@ -6891,8 +6887,8 @@
         <w:t xml:space="preserve">.</w:t>
       </w:r>
     </w:p>
-    <w:bookmarkEnd w:id="46"/>
-    <w:bookmarkStart w:id="48" w:name="ref-mothilal2020dice"/>
+    <w:bookmarkEnd w:id="47"/>
+    <w:bookmarkStart w:id="49" w:name="ref-mothilal2020dice"/>
     <w:p>
       <w:pPr>
         <w:pStyle w:val="Bibliography"/>
@@ -6937,7 +6933,7 @@
       <w:r>
         <w:t xml:space="preserve"> </w:t>
       </w:r>
-      <w:hyperlink r:id="rId47">
+      <w:hyperlink r:id="rId48">
         <w:r>
           <w:rPr>
             <w:rStyle w:val="Hyperlink"/>
@@ -6949,8 +6945,8 @@
         <w:t xml:space="preserve">.</w:t>
       </w:r>
     </w:p>
-    <w:bookmarkEnd w:id="48"/>
-    <w:bookmarkStart w:id="49" w:name="ref-bhatt2020evaluating"/>
+    <w:bookmarkEnd w:id="49"/>
+    <w:bookmarkStart w:id="50" w:name="ref-bhatt2020evaluating"/>
     <w:p>
       <w:pPr>
         <w:pStyle w:val="Bibliography"/>
@@ -6993,8 +6989,8 @@
         <w:t xml:space="preserve">, 2020, pp. 3016–3022.</w:t>
       </w:r>
     </w:p>
-    <w:bookmarkEnd w:id="49"/>
-    <w:bookmarkStart w:id="50" w:name="ref-samek2017evaluating"/>
+    <w:bookmarkEnd w:id="50"/>
+    <w:bookmarkStart w:id="51" w:name="ref-samek2017evaluating"/>
     <w:p>
       <w:pPr>
         <w:pStyle w:val="Bibliography"/>
@@ -7031,8 +7027,8 @@
         <w:t xml:space="preserve">, vol. 28, no. 11, pp. 2660–2673, 2017.</w:t>
       </w:r>
     </w:p>
-    <w:bookmarkEnd w:id="50"/>
-    <w:bookmarkStart w:id="51" w:name="ref-hooker2019benchmark"/>
+    <w:bookmarkEnd w:id="51"/>
+    <w:bookmarkStart w:id="52" w:name="ref-hooker2019benchmark"/>
     <w:p>
       <w:pPr>
         <w:pStyle w:val="Bibliography"/>
@@ -7075,8 +7071,8 @@
         <w:t xml:space="preserve">, 2019, pp. 9737–9748.</w:t>
       </w:r>
     </w:p>
-    <w:bookmarkEnd w:id="51"/>
-    <w:bookmarkStart w:id="53" w:name="ref-alvarezmelis2018robustness"/>
+    <w:bookmarkEnd w:id="52"/>
+    <w:bookmarkStart w:id="54" w:name="ref-alvarezmelis2018robustness"/>
     <w:p>
       <w:pPr>
         <w:pStyle w:val="Bibliography"/>
@@ -7121,7 +7117,7 @@
       <w:r>
         <w:t xml:space="preserve"> </w:t>
       </w:r>
-      <w:hyperlink r:id="rId52">
+      <w:hyperlink r:id="rId53">
         <w:r>
           <w:rPr>
             <w:rStyle w:val="Hyperlink"/>
@@ -7130,8 +7126,8 @@
         </w:r>
       </w:hyperlink>
     </w:p>
-    <w:bookmarkEnd w:id="53"/>
-    <w:bookmarkStart w:id="54" w:name="ref-herrera2026framework"/>
+    <w:bookmarkEnd w:id="54"/>
+    <w:bookmarkStart w:id="55" w:name="ref-herrera2026framework"/>
     <w:p>
       <w:pPr>
         <w:pStyle w:val="Bibliography"/>
@@ -7182,8 +7178,8 @@
         <w:t xml:space="preserve">, no. 3, 2026.</w:t>
       </w:r>
     </w:p>
-    <w:bookmarkEnd w:id="54"/>
-    <w:bookmarkStart w:id="55" w:name="ref-bansal2021whole"/>
+    <w:bookmarkEnd w:id="55"/>
+    <w:bookmarkStart w:id="56" w:name="ref-bansal2021whole"/>
     <w:p>
       <w:pPr>
         <w:pStyle w:val="Bibliography"/>
@@ -7263,8 +7259,8 @@
         <w:t xml:space="preserve">, 2021, pp. 1–16.</w:t>
       </w:r>
     </w:p>
-    <w:bookmarkEnd w:id="55"/>
-    <w:bookmarkStart w:id="56" w:name="ref-adebayo2018sanity"/>
+    <w:bookmarkEnd w:id="56"/>
+    <w:bookmarkStart w:id="57" w:name="ref-adebayo2018sanity"/>
     <w:p>
       <w:pPr>
         <w:pStyle w:val="Bibliography"/>
@@ -7307,8 +7303,8 @@
         <w:t xml:space="preserve">, 2018, pp. 9505–9515.</w:t>
       </w:r>
     </w:p>
-    <w:bookmarkEnd w:id="56"/>
-    <w:bookmarkStart w:id="57" w:name="ref-slack2020fooling"/>
+    <w:bookmarkEnd w:id="57"/>
+    <w:bookmarkStart w:id="58" w:name="ref-slack2020fooling"/>
     <w:p>
       <w:pPr>
         <w:pStyle w:val="Bibliography"/>
@@ -7372,8 +7368,8 @@
         <w:t xml:space="preserve">, 2020, pp. 180–186.</w:t>
       </w:r>
     </w:p>
-    <w:bookmarkEnd w:id="57"/>
-    <w:bookmarkStart w:id="58" w:name="ref-rudin2019stop"/>
+    <w:bookmarkEnd w:id="58"/>
+    <w:bookmarkStart w:id="59" w:name="ref-rudin2019stop"/>
     <w:p>
       <w:pPr>
         <w:pStyle w:val="Bibliography"/>
@@ -7410,8 +7406,8 @@
         <w:t xml:space="preserve">, vol. 1, no. 5, pp. 206–215, 2019.</w:t>
       </w:r>
     </w:p>
-    <w:bookmarkEnd w:id="58"/>
-    <w:bookmarkStart w:id="59" w:name="ref-lofstrom2026concerning"/>
+    <w:bookmarkEnd w:id="59"/>
+    <w:bookmarkStart w:id="60" w:name="ref-lofstrom2026concerning"/>
     <w:p>
       <w:pPr>
         <w:pStyle w:val="Bibliography"/>
@@ -7457,8 +7453,8 @@
         <w:t xml:space="preserve">, vol. 384, no. 2327, p. 20250079, 2026.</w:t>
       </w:r>
     </w:p>
-    <w:bookmarkEnd w:id="59"/>
-    <w:bookmarkStart w:id="61" w:name="ref-chiaburu2026uncertainty"/>
+    <w:bookmarkEnd w:id="60"/>
+    <w:bookmarkStart w:id="62" w:name="ref-chiaburu2026uncertainty"/>
     <w:p>
       <w:pPr>
         <w:pStyle w:val="Bibliography"/>
@@ -7521,7 +7517,7 @@
       <w:r>
         <w:t xml:space="preserve"> </w:t>
       </w:r>
-      <w:hyperlink r:id="rId60">
+      <w:hyperlink r:id="rId61">
         <w:r>
           <w:rPr>
             <w:rStyle w:val="Hyperlink"/>
@@ -7533,8 +7529,8 @@
         <w:t xml:space="preserve">.</w:t>
       </w:r>
     </w:p>
-    <w:bookmarkEnd w:id="61"/>
-    <w:bookmarkStart w:id="63" w:name="ref-christodoulou2026impact"/>
+    <w:bookmarkEnd w:id="62"/>
+    <w:bookmarkStart w:id="64" w:name="ref-christodoulou2026impact"/>
     <w:p>
       <w:pPr>
         <w:pStyle w:val="Bibliography"/>
@@ -7573,7 +7569,7 @@
       <w:r>
         <w:t xml:space="preserve"> </w:t>
       </w:r>
-      <w:hyperlink r:id="rId62">
+      <w:hyperlink r:id="rId63">
         <w:r>
           <w:rPr>
             <w:rStyle w:val="Hyperlink"/>
@@ -7585,8 +7581,8 @@
         <w:t xml:space="preserve">.</w:t>
       </w:r>
     </w:p>
-    <w:bookmarkEnd w:id="63"/>
-    <w:bookmarkStart w:id="65" w:name="ref-cheng2026uncertainty"/>
+    <w:bookmarkEnd w:id="64"/>
+    <w:bookmarkStart w:id="66" w:name="ref-cheng2026uncertainty"/>
     <w:p>
       <w:pPr>
         <w:pStyle w:val="Bibliography"/>
@@ -7634,7 +7630,7 @@
       <w:r>
         <w:t xml:space="preserve"> </w:t>
       </w:r>
-      <w:hyperlink r:id="rId64">
+      <w:hyperlink r:id="rId65">
         <w:r>
           <w:rPr>
             <w:rStyle w:val="Hyperlink"/>
@@ -7646,8 +7642,8 @@
         <w:t xml:space="preserve">.</w:t>
       </w:r>
     </w:p>
-    <w:bookmarkEnd w:id="65"/>
-    <w:bookmarkStart w:id="66" w:name="ref-becker1996adult"/>
+    <w:bookmarkEnd w:id="66"/>
+    <w:bookmarkStart w:id="67" w:name="ref-becker1996adult"/>
     <w:p>
       <w:pPr>
         <w:pStyle w:val="Bibliography"/>
@@ -7675,50 +7671,50 @@
       </w:r>
       <w:r>
         <w:t xml:space="preserve">UCI Machine Learning Repository, 1996.</w:t>
-      </w:r>
-    </w:p>
-    <w:bookmarkEnd w:id="66"/>
-    <w:bookmarkStart w:id="67" w:name="ref-hofmann1994statlog"/>
-    <w:p>
-      <w:pPr>
-        <w:pStyle w:val="Bibliography"/>
-      </w:pPr>
-      <w:r>
-        <w:t xml:space="preserve">[19]</w:t>
-      </w:r>
-      <w:r>
-        <w:t xml:space="preserve"> </w:t>
-      </w:r>
-      <w:r>
-        <w:t xml:space="preserve">	</w:t>
-      </w:r>
-      <w:r>
-        <w:t xml:space="preserve">H. Hofmann,</w:t>
-      </w:r>
-      <w:r>
-        <w:t xml:space="preserve"> </w:t>
-      </w:r>
-      <w:r>
-        <w:t xml:space="preserve">“Statlog (</w:t>
-      </w:r>
-      <w:r>
-        <w:t xml:space="preserve">German</w:t>
-      </w:r>
-      <w:r>
-        <w:t xml:space="preserve"> </w:t>
-      </w:r>
-      <w:r>
-        <w:t xml:space="preserve">credit data) [dataset].”</w:t>
-      </w:r>
-      <w:r>
-        <w:t xml:space="preserve"> </w:t>
-      </w:r>
-      <w:r>
-        <w:t xml:space="preserve">UCI Machine Learning Repository, 1994.</w:t>
       </w:r>
     </w:p>
     <w:bookmarkEnd w:id="67"/>
-    <w:bookmarkStart w:id="68" w:name="ref-breiman2001random"/>
+    <w:bookmarkStart w:id="68" w:name="ref-hofmann1994statlog"/>
+    <w:p>
+      <w:pPr>
+        <w:pStyle w:val="Bibliography"/>
+      </w:pPr>
+      <w:r>
+        <w:t xml:space="preserve">[19]</w:t>
+      </w:r>
+      <w:r>
+        <w:t xml:space="preserve"> </w:t>
+      </w:r>
+      <w:r>
+        <w:t xml:space="preserve">	</w:t>
+      </w:r>
+      <w:r>
+        <w:t xml:space="preserve">H. Hofmann,</w:t>
+      </w:r>
+      <w:r>
+        <w:t xml:space="preserve"> </w:t>
+      </w:r>
+      <w:r>
+        <w:t xml:space="preserve">“Statlog (</w:t>
+      </w:r>
+      <w:r>
+        <w:t xml:space="preserve">German</w:t>
+      </w:r>
+      <w:r>
+        <w:t xml:space="preserve"> </w:t>
+      </w:r>
+      <w:r>
+        <w:t xml:space="preserve">credit data) [dataset].”</w:t>
+      </w:r>
+      <w:r>
+        <w:t xml:space="preserve"> </w:t>
+      </w:r>
+      <w:r>
+        <w:t xml:space="preserve">UCI Machine Learning Repository, 1994.</w:t>
+      </w:r>
+    </w:p>
+    <w:bookmarkEnd w:id="68"/>
+    <w:bookmarkStart w:id="69" w:name="ref-breiman2001random"/>
     <w:p>
       <w:pPr>
         <w:pStyle w:val="Bibliography"/>
@@ -7755,8 +7751,8 @@
         <w:t xml:space="preserve">, vol. 45, no. 1, pp. 5–32, 2001.</w:t>
       </w:r>
     </w:p>
-    <w:bookmarkEnd w:id="68"/>
-    <w:bookmarkStart w:id="69" w:name="ref-chen2016xgboost"/>
+    <w:bookmarkEnd w:id="69"/>
+    <w:bookmarkStart w:id="70" w:name="ref-chen2016xgboost"/>
     <w:p>
       <w:pPr>
         <w:pStyle w:val="Bibliography"/>
@@ -7805,8 +7801,8 @@
         <w:t xml:space="preserve">, 2016, pp. 785–794.</w:t>
       </w:r>
     </w:p>
-    <w:bookmarkEnd w:id="69"/>
-    <w:bookmarkStart w:id="70" w:name="ref-wilcoxon1945individual"/>
+    <w:bookmarkEnd w:id="70"/>
+    <w:bookmarkStart w:id="71" w:name="ref-wilcoxon1945individual"/>
     <w:p>
       <w:pPr>
         <w:pStyle w:val="Bibliography"/>
@@ -7843,8 +7839,8 @@
         <w:t xml:space="preserve">, vol. 1, no. 6, pp. 80–83, 1945.</w:t>
       </w:r>
     </w:p>
-    <w:bookmarkEnd w:id="70"/>
-    <w:bookmarkStart w:id="71" w:name="ref-holm1979simple"/>
+    <w:bookmarkEnd w:id="71"/>
+    <w:bookmarkStart w:id="72" w:name="ref-holm1979simple"/>
     <w:p>
       <w:pPr>
         <w:pStyle w:val="Bibliography"/>
@@ -7881,8 +7877,8 @@
         <w:t xml:space="preserve">, vol. 6, no. 2, pp. 65–70, 1979.</w:t>
       </w:r>
     </w:p>
-    <w:bookmarkEnd w:id="71"/>
-    <w:bookmarkStart w:id="72" w:name="ref-lakens2013calculating"/>
+    <w:bookmarkEnd w:id="72"/>
+    <w:bookmarkStart w:id="73" w:name="ref-lakens2013calculating"/>
     <w:p>
       <w:pPr>
         <w:pStyle w:val="Bibliography"/>
@@ -7928,8 +7924,8 @@
         <w:t xml:space="preserve">, vol. 4, p. 863, 2013.</w:t>
       </w:r>
     </w:p>
-    <w:bookmarkEnd w:id="72"/>
-    <w:bookmarkStart w:id="74" w:name="ref-kruskal1952use"/>
+    <w:bookmarkEnd w:id="73"/>
+    <w:bookmarkStart w:id="75" w:name="ref-kruskal1952use"/>
     <w:p>
       <w:pPr>
         <w:pStyle w:val="Bibliography"/>
@@ -7968,7 +7964,7 @@
       <w:r>
         <w:t xml:space="preserve"> </w:t>
       </w:r>
-      <w:hyperlink r:id="rId73">
+      <w:hyperlink r:id="rId74">
         <w:r>
           <w:rPr>
             <w:rStyle w:val="Hyperlink"/>
@@ -7980,8 +7976,8 @@
         <w:t xml:space="preserve">.</w:t>
       </w:r>
     </w:p>
-    <w:bookmarkEnd w:id="74"/>
-    <w:bookmarkStart w:id="76" w:name="ref-cameron2015practitioner"/>
+    <w:bookmarkEnd w:id="75"/>
+    <w:bookmarkStart w:id="77" w:name="ref-cameron2015practitioner"/>
     <w:p>
       <w:pPr>
         <w:pStyle w:val="Bibliography"/>
@@ -8020,7 +8016,7 @@
       <w:r>
         <w:t xml:space="preserve"> </w:t>
       </w:r>
-      <w:hyperlink r:id="rId75">
+      <w:hyperlink r:id="rId76">
         <w:r>
           <w:rPr>
             <w:rStyle w:val="Hyperlink"/>
@@ -8032,8 +8028,8 @@
         <w:t xml:space="preserve">.</w:t>
       </w:r>
     </w:p>
-    <w:bookmarkEnd w:id="76"/>
-    <w:bookmarkStart w:id="77" w:name="ref-platt1999probabilistic"/>
+    <w:bookmarkEnd w:id="77"/>
+    <w:bookmarkStart w:id="78" w:name="ref-platt1999probabilistic"/>
     <w:p>
       <w:pPr>
         <w:pStyle w:val="Bibliography"/>
@@ -8076,9 +8072,9 @@
         <w:t xml:space="preserve">, A. J. Smola, P. Bartlett, B. Schölkopf, and D. Schuurmans, Eds., MIT Press, 1999, pp. 61–74.</w:t>
       </w:r>
     </w:p>
-    <w:bookmarkEnd w:id="77"/>
     <w:bookmarkEnd w:id="78"/>
     <w:bookmarkEnd w:id="79"/>
+    <w:bookmarkEnd w:id="80"/>
     <w:p>
       <w:pPr>
         <w:pStyle w:val="Heading1"/>
@@ -8119,8 +8115,8 @@
         <w:t xml:space="preserve">author to ensure accuracy and coherence.</w:t>
       </w:r>
     </w:p>
-    <w:bookmarkEnd w:id="41"/>
-    <w:bookmarkStart w:id="79" w:name="bibliography"/>
+    <w:bookmarkEnd w:id="42"/>
+    <w:bookmarkStart w:id="80" w:name="bibliography"/>
     <w:sectPr>
       <w:pgSz w:w="12240" w:h="15840"/>
       <w:pgMar w:top="1418" w:right="1418" w:bottom="1418" w:left="1418" w:header="720" w:footer="720" w:gutter="0"/>

</xml_diff>

<commit_message>
docs(paper-d): author profession; three added references approved
Profession 'PhD candidate' per the journal's author instructions (checked
2026-10-03: name, both surnames, profession, telephones, email, workplace,
country, ORCID). The author checked and approved Kruskal-Wallis,
Cameron-Miller and Platt. Submission route noted: the instructions say the
journal website, not email.

Co-Authored-By: Claude Opus 5.5 <noreply@anthropic.com>
</commit_message>
<xml_diff>
--- a/docs/reports/paper_d/submission/paper_d_full.docx
+++ b/docs/reports/paper_d/submission/paper_d_full.docx
@@ -67,16 +67,7 @@
         <w:pStyle w:val="BodyText"/>
       </w:pPr>
       <w:r>
-        <w:t xml:space="preserve">[</w:t>
-      </w:r>
-      <w:r>
-        <w:t xml:space="preserve">AUTHOR: profession</w:t>
-      </w:r>
-      <w:r>
-        <w:t xml:space="preserve">]</w:t>
-      </w:r>
-      <w:r>
-        <w:t xml:space="preserve">. Department of Computer Science, Universidad Americana de Europa</w:t>
+        <w:t xml:space="preserve">PhD candidate. Department of Computer Science, Universidad Americana de Europa</w:t>
       </w:r>
       <w:r>
         <w:t xml:space="preserve"> </w:t>

</xml_diff>